<commit_message>
Discipline of textual criticism
</commit_message>
<xml_diff>
--- a/build/docx/Bog-zachowal-swoj-Tekst-Wilbur-Pickering.docx
+++ b/build/docx/Bog-zachowal-swoj-Tekst-Wilbur-Pickering.docx
@@ -3588,7 +3588,7 @@
         <w:pStyle w:val="BodyText"/>
       </w:pPr>
       <w:r>
-        <w:t xml:space="preserve">Dyscyplina krytyki tekstu (jakiegokolwiek tekstu) bazuje na założeniu/insynuacji/oświadczeniu, że istnieją uzasadnione wątpliwości co do dokładnego oryginalnego brzmienia tekstu. Nikt nie zajmuje się krytyką tekstu na przykład Biblii Króla Jakuba z 1611 roku, ponieważ nadal istnieją kopie oryginalnego wydania. W odniesieniu do krytyki tekstu Nowego Testamentu</w:t>
+        <w:t xml:space="preserve">Dyscyplina krytyki tekstu (jakiegokolwiek tekstu) bazuje na założeniu/insynuacji/oświadczeniu, że istnieją uzasadnione wątpliwości co do dokładnego oryginalnego sformułowania tekstu. Nikt nie zajmuje się krytyką tekstu na przykład Biblii Króla Jakuba z 1611 roku, ponieważ nadal istnieją egzemplarze oryginalnego wydania. W odniesieniu do krytyki tekstu Nowego Testamentu</w:t>
       </w:r>
       <w:r>
         <w:t xml:space="preserve"> </w:t>
@@ -3599,24 +3599,6 @@
           <w:b/>
         </w:rPr>
         <w:t xml:space="preserve">kluczową kwestią jest zachowanie jego Tekstu. Aby jakikolwiek tekst miał obiektywny autorytet, musimy wiedzieć, czym on jest.</w:t>
-      </w:r>
-    </w:p>
-    <w:p>
-      <w:pPr>
-        <w:pStyle w:val="BodyText"/>
-      </w:pPr>
-      <w:r>
-        <w:t xml:space="preserve">The discipline of textual criticism (of whatever text) is predicated on the assumption/allegation/declaration that there is a legitimate doubt about the precise original wording of a text. No one does textual criticism on the 1611 King James Bible, for example, since copies of the original printing still exist. With reference to New Testament textual criticism,</w:t>
-      </w:r>
-      <w:r>
-        <w:t xml:space="preserve"> </w:t>
-      </w:r>
-      <w:r>
-        <w:rPr>
-          <w:bCs/>
-          <w:b/>
-        </w:rPr>
-        <w:t xml:space="preserve">the crucial point at issue is the preservation of its Text. For any text to have objecttive authority, we have to know what it is.</w:t>
       </w:r>
     </w:p>
     <w:bookmarkEnd w:id="135"/>

</xml_diff>

<commit_message>
Some areas in better position
</commit_message>
<xml_diff>
--- a/build/docx/Bog-zachowal-swoj-Tekst-Wilbur-Pickering.docx
+++ b/build/docx/Bog-zachowal-swoj-Tekst-Wilbur-Pickering.docx
@@ -3599,6 +3599,14 @@
           <w:b/>
         </w:rPr>
         <w:t xml:space="preserve">kluczową kwestią jest zachowanie jego Tekstu. Aby jakikolwiek tekst miał obiektywny autorytet, musimy wiedzieć, czym on jest.</w:t>
+      </w:r>
+    </w:p>
+    <w:p>
+      <w:pPr>
+        <w:pStyle w:val="BodyText"/>
+      </w:pPr>
+      <w:r>
+        <w:t xml:space="preserve">Jednakże, kontynuując, przypuszczalnie niektóre obszary mogą znajdować się w lepszej sytuacji, jeśli chodzi o ochronę i przekazywanie prawdziwego tekstu niż inne.</w:t>
       </w:r>
     </w:p>
     <w:bookmarkEnd w:id="135"/>

</xml_diff>

<commit_message>
God's point of view
</commit_message>
<xml_diff>
--- a/build/docx/Bog-zachowal-swoj-Tekst-Wilbur-Pickering.docx
+++ b/build/docx/Bog-zachowal-swoj-Tekst-Wilbur-Pickering.docx
@@ -3756,15 +3756,7 @@
         <w:pStyle w:val="BodyText"/>
       </w:pPr>
       <w:r>
-        <w:t xml:space="preserve">Rozważ teraz tę kwestię z Bożego punktu widzenia. Komu powinien powierzyć główną odpowiedzialność za wierne przekazanie Tekstu Nowego Testamentu (przypomnij sobie 1 Księgę Kronik 16,15)? Jeśli Duch Święty miał brać aktywny udział w tym procesie, na czym powinien skupić swoje wysiłki? Można przypuszczać, że przewagę mieliby ci, którzy biegle posługiwali się językiem greckim, a preferowane byłyby obszary, gdzie język ten pozostawał w aktywnym użyciu. Aby wierne przekazanie mogło nastąpić, kopiści musieli biegle posługiwać się językiem greckim i to przez długi czas. Gdzie więc dominował język grecki? Oczywiście w Grecji i Azji Mniejszej. Grecki do dziś jest językiem ojczystym Grecji (zmieniwszy się znacząco w ciągu upływających stuleci, jak każdy żywy język musi). Dominacja greckiego w regionie Morza Egejskiego była gwarantowana przez Cesarstwo Bizantyjskie przez wiele stuleci, w rzeczywistości aż do wynalezienia druku. Konstantynopol upadł zdobyty przez Turków Osmańskich w 1453 roku, Biblia Gutenberga (łacińska) została wydrukowana zaledwie trzy lata później, podczas gdy pierwszy drukowany grecki Nowy Testament pojawił się w 1516 roku. (Tym, którzy wierzą w Opatrzność, sugerowałbym, że mamy tu do czynienia z mocnym przykładem).</w:t>
-      </w:r>
-    </w:p>
-    <w:p>
-      <w:pPr>
-        <w:pStyle w:val="BodyText"/>
-      </w:pPr>
-      <w:r>
-        <w:t xml:space="preserve">Now consider the problem from God’s point of view. To whom should He entrust the primary responsibility for the faithful transmission of the NT Text (recall 1 Chronicles 16,15)? If the Holy Spirit was going to take an active part in the process, where should He concentrate His efforts? Presumably fluent speakers of Greek would have the inside track, and areas where Greek would continue in active use would be preferred. For a faithful transmission to occur the copyists had to be proficient in Greek, and over the long haul. So where was Greek predominant? Evidently in Greece and Asia Minor. Greek is the mother tongue of Greece to this day (having changed considerably during the intervening centuries, as any living language must). The dominance of Greek in the Aegean area was guaranteed by the Byzantine Empire for many centuries, in fact, until the invention of printing. Constantinople fell to the Ottoman Turks in 1453, the Gutenberg Bible (Latin) was printed just three years later, while the first printed Greek New Testament appeared in 1516. (For those who believe in Providence, I would suggest that here we have a powerful case in point).</w:t>
+        <w:t xml:space="preserve">Rozważ teraz tę kwestię z Bożego punktu widzenia. Komu powinien powierzyć główną odpowiedzialność za wierne przekazanie Tekstu Nowego Testamentu (przypomnij sobie 1 Księgę Kronik 16,15)? Jeśli Duch Święty miał brać aktywny udział w tym procesie, na czym powinien skupić swoje wysiłki? Przypuszczalnie przewagę mieliby ci, którzy biegle posługiwali się językiem greckim, a preferowane byłyby obszary, gdzie język ten pozostawał w aktywnym użyciu. Aby wierne przekazanie mogło nastąpić, kopiści musieli biegle posługiwać się językiem greckim i to przez długi czas. Gdzie więc dominował język grecki? Oczywiście w Grecji i Azji Mniejszej. Grecki do dziś jest językiem ojczystym Grecji (zmieniwszy się znacząco w ciągu upływających stuleci, jak każdy żywy język musi). Dominacja greckiego w regionie Morza Egejskiego była gwarantowana przez Cesarstwo Bizantyjskie przez wiele stuleci, w rzeczywistości aż do wynalezienia druku. Konstantynopol upadł zdobyty przez Turków Osmańskich w 1453 roku, Biblia Gutenberga (łacińska) została wydrukowana zaledwie trzy lata później, podczas gdy pierwszy drukowany grecki Nowy Testament pojawił się w 1516 roku. (Tym, którzy wierzą w Opatrzność, sugerowałbym, że mamy tu do czynienia z mocnym przykładem).</w:t>
       </w:r>
     </w:p>
     <w:bookmarkEnd w:id="138"/>

</xml_diff>

<commit_message>
As the figure suggests
</commit_message>
<xml_diff>
--- a/build/docx/Bog-zachowal-swoj-Tekst-Wilbur-Pickering.docx
+++ b/build/docx/Bog-zachowal-swoj-Tekst-Wilbur-Pickering.docx
@@ -691,7 +691,7 @@
       </w:r>
     </w:p>
     <w:bookmarkEnd w:id="25"/>
-    <w:bookmarkStart w:id="159" w:name="część-i-dowody-historyczne"/>
+    <w:bookmarkStart w:id="160" w:name="część-i-dowody-historyczne"/>
     <w:p>
       <w:pPr>
         <w:pStyle w:val="Heading1"/>
@@ -1780,7 +1780,7 @@
     </w:p>
     <w:bookmarkEnd w:id="73"/>
     <w:bookmarkEnd w:id="74"/>
-    <w:bookmarkStart w:id="158" w:name="historyczne-dowody-na-zachowanie-tekstu"/>
+    <w:bookmarkStart w:id="159" w:name="historyczne-dowody-na-zachowanie-tekstu"/>
     <w:p>
       <w:pPr>
         <w:pStyle w:val="Heading2"/>
@@ -4052,7 +4052,7 @@
       </w:r>
     </w:p>
     <w:bookmarkEnd w:id="137"/>
-    <w:bookmarkStart w:id="151" w:name="czy-przekazywanie-przebiegało-normalnie"/>
+    <w:bookmarkStart w:id="152" w:name="czy-przekazywanie-przebiegało-normalnie"/>
     <w:p>
       <w:pPr>
         <w:pStyle w:val="Heading3"/>
@@ -4410,13 +4410,22 @@
         <w:pStyle w:val="BodyText"/>
       </w:pPr>
       <w:r>
-        <w:t xml:space="preserve">Dla przykładu Gajusz[^Kajusz], ortodoksyjny Ojciec piszący pod koniec II wieku, wymienił czterech heretyków, którzy nie tylko zmieniali tekst, ale mieli uczniów, którzy powielali kopie ich dzieł. Szczególnie interesujący tu jest jego zarzut, że nie mogli oni zaprzeczyć swojej winie, ponieważ nie byli w stanie przedstawić oryginałów, z których sporządzili swoje kopie.</w:t>
+        <w:t xml:space="preserve">Dla przykładu Gajusz</w:t>
       </w:r>
       <w:r>
         <w:rPr>
           <w:rStyle w:val="FootnoteReference"/>
         </w:rPr>
         <w:footnoteReference w:id="150"/>
+      </w:r>
+      <w:r>
+        <w:t xml:space="preserve">, ortodoksyjny Ojciec piszący pod koniec II wieku, wymienił czterech heretyków, którzy nie tylko zmieniali tekst, ale mieli uczniów, którzy powielali kopie ich dzieł. Szczególnie interesujący tu jest jego zarzut, że nie mogli oni zaprzeczyć swojej winie, ponieważ nie byli w stanie przedstawić oryginałów, z których sporządzili swoje kopie.</w:t>
+      </w:r>
+      <w:r>
+        <w:rPr>
+          <w:rStyle w:val="FootnoteReference"/>
+        </w:rPr>
+        <w:footnoteReference w:id="151"/>
       </w:r>
       <w:r>
         <w:t xml:space="preserve"> </w:t>
@@ -4449,8 +4458,8 @@
         <w:t xml:space="preserve">Presja wynikałaby nie tylko z Autografów, ale także z już ugruntowanej dynamiki przekazywania tekstu, jaką cieszyła się większościowa forma tekstowa. Jak już omówiliśmy, statystyczne prawdopodobieństwa przemawiające przeciwko jakimkolwiek zniekształconym formom tekstowym byłyby przytłaczające. Krótko mówiąc, chociaż powstała oszałamiająca liczba wariantów, sądząc po zachowanych świadkach, i rzeczywiście wywierały one zakłócający wpływ na strumień przekazywania, nie zdołałyby one udaremnić postępu normalnego przebiegu przekazywania.</w:t>
       </w:r>
     </w:p>
-    <w:bookmarkEnd w:id="151"/>
-    <w:bookmarkStart w:id="157" w:name="strumień-przekazywania"/>
+    <w:bookmarkEnd w:id="152"/>
+    <w:bookmarkStart w:id="158" w:name="strumień-przekazywania"/>
     <w:p>
       <w:pPr>
         <w:pStyle w:val="Heading3"/>
@@ -4509,18 +4518,18 @@
           <wp:inline>
             <wp:extent cx="5334000" cy="3390972"/>
             <wp:effectExtent b="0" l="0" r="0" t="0"/>
-            <wp:docPr descr="Rysunek A" title="" id="153" name="Picture"/>
+            <wp:docPr descr="Rysunek A" title="" id="154" name="Picture"/>
             <a:graphic>
               <a:graphicData uri="http://schemas.openxmlformats.org/drawingml/2006/picture">
                 <pic:pic>
                   <pic:nvPicPr>
-                    <pic:cNvPr descr="images/Rysunek_A.jpg" id="154" name="Picture"/>
+                    <pic:cNvPr descr="images/Rysunek_A.jpg" id="155" name="Picture"/>
                     <pic:cNvPicPr>
                       <a:picLocks noChangeArrowheads="1" noChangeAspect="1"/>
                     </pic:cNvPicPr>
                   </pic:nvPicPr>
                   <pic:blipFill>
-                    <a:blip r:embed="rId152"/>
+                    <a:blip r:embed="rId153"/>
                     <a:stretch>
                       <a:fillRect/>
                     </a:stretch>
@@ -4560,22 +4569,22 @@
         <w:rPr>
           <w:rStyle w:val="FootnoteReference"/>
         </w:rPr>
-        <w:footnoteReference w:id="155"/>
-      </w:r>
-    </w:p>
-    <w:p>
-      <w:pPr>
-        <w:pStyle w:val="BodyText"/>
-      </w:pPr>
-      <w:r>
-        <w:t xml:space="preserve">Jak sugeruje rysunek, twierdzę, że kampania Dioklecjana miała oczyszczający wpływ na strumień przekazywania. Aby wytrzymać tortury, zamiast oddać manuskrypt(y), trzeba było być prawdziwie oddanym wierzącym, typem człowieka, który pragnęł dobrych kopii Pism Świętych. Dlatego też zniszczono prawdopodobnie głównie bardziej zanieczyszczone manuskrypty, pozostawiając te czystsze, by ponownie zasiliły ziemię.</w:t>
-      </w:r>
-      <w:r>
-        <w:rPr>
-          <w:rStyle w:val="FootnoteReference"/>
-        </w:rPr>
         <w:footnoteReference w:id="156"/>
       </w:r>
+    </w:p>
+    <w:p>
+      <w:pPr>
+        <w:pStyle w:val="BodyText"/>
+      </w:pPr>
+      <w:r>
+        <w:t xml:space="preserve">Jak sugeruje rysunek, twierdzę, że kampania Dioklecjana miała oczyszczający wpływ na strumień przekazywania. Aby wytrzymać tortury, zamiast oddać manuskrypt(y), trzeba było być prawdziwie oddanym wierzącym, typem człowieka, który pragnął dobrych kopii Pism Świętych. Dlatego też zniszczono prawdopodobnie głównie bardziej zanieczyszczone manuskrypty, pozostawiając te czystsze manuskrypty, by ponownie zasiliły ziemię.</w:t>
+      </w:r>
+      <w:r>
+        <w:rPr>
+          <w:rStyle w:val="FootnoteReference"/>
+        </w:rPr>
+        <w:footnoteReference w:id="157"/>
+      </w:r>
       <w:r>
         <w:t xml:space="preserve"> </w:t>
       </w:r>
@@ -4583,17 +4592,9 @@
         <w:t xml:space="preserve">Strzałka wewnątrz stożków reprezentuje Rodzinę 35 (patrz część II poniżej).</w:t>
       </w:r>
     </w:p>
-    <w:p>
-      <w:pPr>
-        <w:pStyle w:val="BodyText"/>
-      </w:pPr>
-      <w:r>
-        <w:t xml:space="preserve">As the figure suggests, I argue that Diocletian’s campaign had a purifying effect upon the stream of transmission. In order to withstand torture rather than give up your MS(S), you would have to be a truly committed believer, the sort of person who would want good copies of the Scriptures. Thus it was probably the more contaminated MSS that were destroyed, in the main, leaving the purer MSS to replenish the earth.2 The arrow within the cones represents Family 35 (see Part II below).</w:t>
-      </w:r>
-    </w:p>
-    <w:bookmarkEnd w:id="157"/>
     <w:bookmarkEnd w:id="158"/>
     <w:bookmarkEnd w:id="159"/>
+    <w:bookmarkEnd w:id="160"/>
     <w:sectPr/>
   </w:body>
 </w:document>
@@ -7653,6 +7654,31 @@
         <w:t xml:space="preserve"> </w:t>
       </w:r>
       <w:r>
+        <w:t xml:space="preserve">Gajusz/Kajusz (II/III wiek). Euzebiusz z Cezarei w dziele Historia kościelna twierdzi, że Kajusz jest autorem dialogu pt. Przeciwko Prokulowi, zwolennikowi Montana. Dzieło to zachowało się we fragmentach. [przyp. tłum.]</w:t>
+      </w:r>
+      <w:r>
+        <w:br/>
+      </w:r>
+      <w:r>
+        <w:t xml:space="preserve">https://pl.wikipedia.org/wiki/Kajusz_(kap%C5%82an)</w:t>
+      </w:r>
+    </w:p>
+  </w:footnote>
+  <w:footnote w:id="151">
+    <w:p>
+      <w:pPr>
+        <w:pStyle w:val="FootnoteText"/>
+      </w:pPr>
+      <w:r>
+        <w:rPr>
+          <w:rStyle w:val="FootnoteReference"/>
+        </w:rPr>
+        <w:footnoteRef/>
+      </w:r>
+      <w:r>
+        <w:t xml:space="preserve"> </w:t>
+      </w:r>
+      <w:r>
         <w:t xml:space="preserve">Zob. Burgon,</w:t>
       </w:r>
       <w:r>
@@ -7670,7 +7696,7 @@
       </w:r>
     </w:p>
   </w:footnote>
-  <w:footnote w:id="155">
+  <w:footnote w:id="156">
     <w:p>
       <w:pPr>
         <w:pStyle w:val="FootnoteText"/>
@@ -7689,7 +7715,7 @@
       </w:r>
     </w:p>
   </w:footnote>
-  <w:footnote w:id="156">
+  <w:footnote w:id="157">
     <w:p>
       <w:pPr>
         <w:pStyle w:val="FootnoteText"/>

</xml_diff>